<commit_message>
Guida riallineamento: Cookiebot assente sullo stage, JSON-LD di script di terzi nel Rich Results Test
Co-Authored-By: Claude Opus 5.5 <noreply@anthropic.com>
Claude-Session: https://claude.ai/code/session_01Rr1X44gsg7BUwMzrRvYrc2
</commit_message>
<xml_diff>
--- a/docs/docx/guida-riallineamento-stage.docx
+++ b/docs/docx/guida-riallineamento-stage.docx
@@ -3502,7 +3502,13 @@
         <w:t xml:space="preserve"> </w:t>
       </w:r>
       <w:r>
-        <w:t xml:space="preserve">una finestra anonima senza accettare i cookie.</w:t>
+        <w:t xml:space="preserve">una finestra anonima. Sullo stage il banner Cookiebot non compare (dominio diverso da quello registrato):</w:t>
+      </w:r>
+      <w:r>
+        <w:t xml:space="preserve"> </w:t>
+      </w:r>
+      <w:r>
+        <w:t xml:space="preserve">il controllo «senza consenso» si fa in produzione, subito dopo il rilascio.</w:t>
       </w:r>
     </w:p>
     <w:p>
@@ -3592,6 +3598,39 @@
       </w:hyperlink>
       <w:r>
         <w:t xml:space="preserve">.</w:t>
+      </w:r>
+    </w:p>
+    <w:p>
+      <w:pPr>
+        <w:numPr>
+          <w:ilvl w:val="0"/>
+          <w:numId w:val="1005"/>
+        </w:numPr>
+      </w:pPr>
+      <w:r>
+        <w:rPr>
+          <w:bCs/>
+          <w:b/>
+        </w:rPr>
+        <w:t xml:space="preserve">Script di terzi</w:t>
+      </w:r>
+      <w:r>
+        <w:t xml:space="preserve"> </w:t>
+      </w:r>
+      <w:r>
+        <w:t xml:space="preserve">— il Rich Results Test esegue il JavaScript, quindi vede anche il JSON-LD inserito da</w:t>
+      </w:r>
+      <w:r>
+        <w:t xml:space="preserve"> </w:t>
+      </w:r>
+      <w:r>
+        <w:t xml:space="preserve">script esterni (es. Yext Knowledge Tags sulle schede struttura). Se trova più elementi di quelli attesi,</w:t>
+      </w:r>
+      <w:r>
+        <w:t xml:space="preserve"> </w:t>
+      </w:r>
+      <w:r>
+        <w:t xml:space="preserve">confrontare con il numero di blocchi arrivati dal server (controllo da PowerShell, punto 1).</w:t>
       </w:r>
     </w:p>
     <w:bookmarkEnd w:id="29"/>

</xml_diff>